<commit_message>
Fix final-candidate review layout and enlarge meter detail evidence.
Co-authored-by: Cursor <cursoragent@cursor.com>
</commit_message>
<xml_diff>
--- a/docs/submission/20260705/pre-fixed-fare-submission-full-set-v1-final-candidate.docx
+++ b/docs/submission/20260705/pre-fixed-fare-submission-full-set-v1-final-candidate.docx
@@ -6134,7 +6134,7 @@
       <w:r>
         <w:drawing>
           <wp:inline distT="0" distB="0" distL="0" distR="0">
-            <wp:extent cx="4953000" cy="40005000"/>
+            <wp:extent cx="6477000" cy="30346650"/>
             <wp:effectExtent t="0" r="0" b="0" l="0"/>
             <wp:docPr id="1" name="" descr="" title=""/>
             <wp:cNvGraphicFramePr>
@@ -6159,7 +6159,7 @@
                   <pic:spPr bwMode="auto">
                     <a:xfrm>
                       <a:off x="0" y="0"/>
-                      <a:ext cx="4953000" cy="40005000"/>
+                      <a:ext cx="6477000" cy="30346650"/>
                     </a:xfrm>
                     <a:prstGeom prst="rect">
                       <a:avLst/>

</xml_diff>

<commit_message>
Finalize transport bureau submission wording
</commit_message>
<xml_diff>
--- a/docs/submission/20260705/pre-fixed-fare-submission-full-set-v1-final-candidate.docx
+++ b/docs/submission/20260705/pre-fixed-fare-submission-full-set-v1-final-candidate.docx
@@ -226,7 +226,31 @@
           <w:sz w:val="21"/>
           <w:szCs w:val="21"/>
         </w:rPr>
-        <w:t xml:space="preserve">代表者氏名：山本 信勝　　　　　　　　　　　　印</w:t>
+        <w:t xml:space="preserve">代表者氏名：山本 信勝</w:t>
+      </w:r>
+      <w:r>
+        <w:rPr>
+          <w:rFonts w:ascii="Yu Gothic" w:cs="Yu Gothic" w:eastAsia="Yu Gothic" w:hAnsi="Yu Gothic"/>
+          <w:b w:val="false"/>
+          <w:bCs w:val="false"/>
+          <w:i w:val="false"/>
+          <w:iCs w:val="false"/>
+          <w:sz w:val="21"/>
+          <w:szCs w:val="21"/>
+        </w:rPr>
+        <w:t xml:space="preserve">	</w:t>
+      </w:r>
+      <w:r>
+        <w:rPr>
+          <w:rFonts w:ascii="Yu Gothic" w:cs="Yu Gothic" w:eastAsia="Yu Gothic" w:hAnsi="Yu Gothic"/>
+          <w:b w:val="false"/>
+          <w:bCs w:val="false"/>
+          <w:i w:val="false"/>
+          <w:iCs w:val="false"/>
+          <w:sz w:val="21"/>
+          <w:szCs w:val="21"/>
+        </w:rPr>
+        <w:t xml:space="preserve">印</w:t>
       </w:r>
     </w:p>
     <w:p>
@@ -279,7 +303,7 @@
           <w:sz w:val="21"/>
           <w:szCs w:val="21"/>
         </w:rPr>
-        <w:t xml:space="preserve">千葉交通圏</w:t>
+        <w:t xml:space="preserve">千葉県</w:t>
       </w:r>
     </w:p>
     <w:p>
@@ -4200,7 +4224,7 @@
                 <w:sz w:val="19"/>
                 <w:szCs w:val="19"/>
               </w:rPr>
-              <w:t xml:space="preserve">別紙1</w:t>
+              <w:t xml:space="preserve">別紙</w:t>
             </w:r>
           </w:p>
         </w:tc>
@@ -4230,7 +4254,7 @@
                 <w:sz w:val="19"/>
                 <w:szCs w:val="19"/>
               </w:rPr>
-              <w:t xml:space="preserve">距離制運賃表</w:t>
+              <w:t xml:space="preserve">記入補助・係数参考</w:t>
             </w:r>
           </w:p>
         </w:tc>
@@ -4260,7 +4284,7 @@
                 <w:sz w:val="19"/>
                 <w:szCs w:val="19"/>
               </w:rPr>
-              <w:t xml:space="preserve">初乗運賃、加算運賃、深夜早朝割増、障害者割引、端数処理、適用開始予定日</w:t>
+              <w:t xml:space="preserve">申請様式リンク、記入補助項目、平準化係数参考</w:t>
             </w:r>
           </w:p>
         </w:tc>
@@ -4290,7 +4314,7 @@
                 <w:sz w:val="19"/>
                 <w:szCs w:val="19"/>
               </w:rPr>
-              <w:t xml:space="preserve">P52〜P56</w:t>
+              <w:t xml:space="preserve">P51〜P53</w:t>
             </w:r>
           </w:p>
         </w:tc>
@@ -4352,7 +4376,7 @@
                 <w:sz w:val="19"/>
                 <w:szCs w:val="19"/>
               </w:rPr>
-              <w:t xml:space="preserve">別紙2</w:t>
+              <w:t xml:space="preserve">別紙1</w:t>
             </w:r>
           </w:p>
         </w:tc>
@@ -4382,7 +4406,7 @@
                 <w:sz w:val="19"/>
                 <w:szCs w:val="19"/>
               </w:rPr>
-              <w:t xml:space="preserve">各種料金表</w:t>
+              <w:t xml:space="preserve">距離制運賃表</w:t>
             </w:r>
           </w:p>
         </w:tc>
@@ -4412,7 +4436,7 @@
                 <w:sz w:val="19"/>
                 <w:szCs w:val="19"/>
               </w:rPr>
-              <w:t xml:space="preserve">迎車料、介助料、待機料、付き添い料、有料道路代、駐車場代等</w:t>
+              <w:t xml:space="preserve">初乗運賃、加算運賃、深夜早朝割増、障害者割引、端数処理、適用開始予定日</w:t>
             </w:r>
           </w:p>
         </w:tc>
@@ -4442,7 +4466,7 @@
                 <w:sz w:val="19"/>
                 <w:szCs w:val="19"/>
               </w:rPr>
-              <w:t xml:space="preserve">P52〜P56</w:t>
+              <w:t xml:space="preserve">P54</w:t>
             </w:r>
           </w:p>
         </w:tc>
@@ -4504,7 +4528,7 @@
                 <w:sz w:val="19"/>
                 <w:szCs w:val="19"/>
               </w:rPr>
-              <w:t xml:space="preserve">補足資料</w:t>
+              <w:t xml:space="preserve">別紙2</w:t>
             </w:r>
           </w:p>
         </w:tc>
@@ -4534,7 +4558,7 @@
                 <w:sz w:val="19"/>
                 <w:szCs w:val="19"/>
               </w:rPr>
-              <w:t xml:space="preserve">乗務員端末における各種料金確認画面証跡</w:t>
+              <w:t xml:space="preserve">各種料金表</w:t>
             </w:r>
           </w:p>
         </w:tc>
@@ -4564,7 +4588,7 @@
                 <w:sz w:val="19"/>
                 <w:szCs w:val="19"/>
               </w:rPr>
-              <w:t xml:space="preserve">事前確定運賃本体と各種料金の別行確認・精算</w:t>
+              <w:t xml:space="preserve">迎車料、介助料、待機料、付き添い料、有料道路代、駐車場代等</w:t>
             </w:r>
           </w:p>
         </w:tc>
@@ -4594,7 +4618,7 @@
                 <w:sz w:val="19"/>
                 <w:szCs w:val="19"/>
               </w:rPr>
-              <w:t xml:space="preserve">P11</w:t>
+              <w:t xml:space="preserve">P55〜P56</w:t>
             </w:r>
           </w:p>
         </w:tc>
@@ -4624,7 +4648,7 @@
                 <w:sz w:val="19"/>
                 <w:szCs w:val="19"/>
               </w:rPr>
-              <w:t xml:space="preserve">画面証跡資料P7</w:t>
+              <w:t xml:space="preserve">別紙セット内</w:t>
             </w:r>
           </w:p>
         </w:tc>
@@ -4686,6 +4710,158 @@
                 <w:sz w:val="19"/>
                 <w:szCs w:val="19"/>
               </w:rPr>
+              <w:t xml:space="preserve">乗務員端末における各種料金確認画面証跡</w:t>
+            </w:r>
+          </w:p>
+        </w:tc>
+        <w:tc>
+          <w:tcPr>
+            <w:tcW w:type="pct" w:w="34%"/>
+            <w:tcMar>
+              <w:top w:type="dxa" w:w="40"/>
+              <w:left w:type="dxa" w:w="60"/>
+              <w:bottom w:type="dxa" w:w="40"/>
+              <w:right w:type="dxa" w:w="60"/>
+            </w:tcMar>
+            <w:vAlign w:val="top"/>
+          </w:tcPr>
+          <w:p>
+            <w:pPr>
+              <w:spacing w:after="40" w:before="0"/>
+              <w:jc w:val="left"/>
+            </w:pPr>
+            <w:r>
+              <w:rPr>
+                <w:rFonts w:ascii="Yu Gothic" w:cs="Yu Gothic" w:eastAsia="Yu Gothic" w:hAnsi="Yu Gothic"/>
+                <w:b w:val="false"/>
+                <w:bCs w:val="false"/>
+                <w:i w:val="false"/>
+                <w:iCs w:val="false"/>
+                <w:sz w:val="19"/>
+                <w:szCs w:val="19"/>
+              </w:rPr>
+              <w:t xml:space="preserve">事前確定運賃本体と各種料金の別行確認・精算</w:t>
+            </w:r>
+          </w:p>
+        </w:tc>
+        <w:tc>
+          <w:tcPr>
+            <w:tcW w:type="pct" w:w="14%"/>
+            <w:tcMar>
+              <w:top w:type="dxa" w:w="40"/>
+              <w:left w:type="dxa" w:w="60"/>
+              <w:bottom w:type="dxa" w:w="40"/>
+              <w:right w:type="dxa" w:w="60"/>
+            </w:tcMar>
+            <w:vAlign w:val="top"/>
+          </w:tcPr>
+          <w:p>
+            <w:pPr>
+              <w:spacing w:after="40" w:before="0"/>
+              <w:jc w:val="center"/>
+            </w:pPr>
+            <w:r>
+              <w:rPr>
+                <w:rFonts w:ascii="Yu Gothic" w:cs="Yu Gothic" w:eastAsia="Yu Gothic" w:hAnsi="Yu Gothic"/>
+                <w:b w:val="false"/>
+                <w:bCs w:val="false"/>
+                <w:i w:val="false"/>
+                <w:iCs w:val="false"/>
+                <w:sz w:val="19"/>
+                <w:szCs w:val="19"/>
+              </w:rPr>
+              <w:t xml:space="preserve">P11</w:t>
+            </w:r>
+          </w:p>
+        </w:tc>
+        <w:tc>
+          <w:tcPr>
+            <w:tcW w:type="pct" w:w="18%"/>
+            <w:tcMar>
+              <w:top w:type="dxa" w:w="40"/>
+              <w:left w:type="dxa" w:w="60"/>
+              <w:bottom w:type="dxa" w:w="40"/>
+              <w:right w:type="dxa" w:w="60"/>
+            </w:tcMar>
+            <w:vAlign w:val="top"/>
+          </w:tcPr>
+          <w:p>
+            <w:pPr>
+              <w:spacing w:after="40" w:before="0"/>
+              <w:jc w:val="left"/>
+            </w:pPr>
+            <w:r>
+              <w:rPr>
+                <w:rFonts w:ascii="Yu Gothic" w:cs="Yu Gothic" w:eastAsia="Yu Gothic" w:hAnsi="Yu Gothic"/>
+                <w:b w:val="false"/>
+                <w:bCs w:val="false"/>
+                <w:i w:val="false"/>
+                <w:iCs w:val="false"/>
+                <w:sz w:val="19"/>
+                <w:szCs w:val="19"/>
+              </w:rPr>
+              <w:t xml:space="preserve">画面証跡資料P7</w:t>
+            </w:r>
+          </w:p>
+        </w:tc>
+      </w:tr>
+      <w:tr>
+        <w:tc>
+          <w:tcPr>
+            <w:tcW w:type="pct" w:w="12%"/>
+            <w:tcMar>
+              <w:top w:type="dxa" w:w="40"/>
+              <w:left w:type="dxa" w:w="60"/>
+              <w:bottom w:type="dxa" w:w="40"/>
+              <w:right w:type="dxa" w:w="60"/>
+            </w:tcMar>
+            <w:vAlign w:val="center"/>
+          </w:tcPr>
+          <w:p>
+            <w:pPr>
+              <w:spacing w:after="40" w:before="0"/>
+              <w:jc w:val="center"/>
+            </w:pPr>
+            <w:r>
+              <w:rPr>
+                <w:rFonts w:ascii="Yu Gothic" w:cs="Yu Gothic" w:eastAsia="Yu Gothic" w:hAnsi="Yu Gothic"/>
+                <w:b w:val="false"/>
+                <w:bCs w:val="false"/>
+                <w:i w:val="false"/>
+                <w:iCs w:val="false"/>
+                <w:sz w:val="19"/>
+                <w:szCs w:val="19"/>
+              </w:rPr>
+              <w:t xml:space="preserve">補足資料</w:t>
+            </w:r>
+          </w:p>
+        </w:tc>
+        <w:tc>
+          <w:tcPr>
+            <w:tcW w:type="pct" w:w="22%"/>
+            <w:tcMar>
+              <w:top w:type="dxa" w:w="40"/>
+              <w:left w:type="dxa" w:w="60"/>
+              <w:bottom w:type="dxa" w:w="40"/>
+              <w:right w:type="dxa" w:w="60"/>
+            </w:tcMar>
+            <w:vAlign w:val="top"/>
+          </w:tcPr>
+          <w:p>
+            <w:pPr>
+              <w:spacing w:after="40" w:before="0"/>
+              <w:jc w:val="left"/>
+            </w:pPr>
+            <w:r>
+              <w:rPr>
+                <w:rFonts w:ascii="Yu Gothic" w:cs="Yu Gothic" w:eastAsia="Yu Gothic" w:hAnsi="Yu Gothic"/>
+                <w:b w:val="false"/>
+                <w:bCs w:val="false"/>
+                <w:i w:val="false"/>
+                <w:iCs w:val="false"/>
+                <w:sz w:val="19"/>
+                <w:szCs w:val="19"/>
+              </w:rPr>
               <w:t xml:space="preserve">E2E確認結果・保存規程・改ざん検知説明</w:t>
             </w:r>
           </w:p>
@@ -4796,7 +4972,7 @@
           <w:sz w:val="17"/>
           <w:szCs w:val="17"/>
         </w:rPr>
-        <w:t xml:space="preserve">※掲載ページは一式提出候補PDF（final-candidate）のページ番号です。再出力時に実ページへ更新されます。</w:t>
+        <w:t xml:space="preserve">※掲載ページは一式提出書類のページ番号です。</w:t>
       </w:r>
     </w:p>
     <w:p>
@@ -6568,7 +6744,7 @@
                 <w:sz w:val="19"/>
                 <w:szCs w:val="19"/>
               </w:rPr>
-              <w:t xml:space="preserve">介護タクシーLP / 見積シミュレーター / 予約システム / メーターアプリ</w:t>
+              <w:t xml:space="preserve">ちばケアタクシー 事前確定運賃システム</w:t>
             </w:r>
           </w:p>
         </w:tc>
@@ -6754,7 +6930,7 @@
                 <w:sz w:val="19"/>
                 <w:szCs w:val="19"/>
               </w:rPr>
-              <w:t xml:space="preserve">運輸局への提出用説明資料案。最終的な申請書類への転記・体裁調整は申請担当者が行う。</w:t>
+              <w:t xml:space="preserve">運輸局への提出用説明資料</w:t>
             </w:r>
           </w:p>
         </w:tc>
@@ -6793,7 +6969,7 @@
           <w:sz w:val="30"/>
           <w:szCs w:val="30"/>
         </w:rPr>
-        <w:t xml:space="preserve">一式提出候補 目次（審査論点順）</w:t>
+        <w:t xml:space="preserve">一式提出書類 目次（審査論点順）</w:t>
       </w:r>
     </w:p>
     <w:tbl>
@@ -9554,7 +9730,7 @@
           <w:sz w:val="21"/>
           <w:szCs w:val="21"/>
         </w:rPr>
-        <w:t xml:space="preserve">ちばケアタクシー LP見積シミュレーター / 予約システム（reservation-v4） / メーターアプリ（care-taxi-meter）</w:t>
+        <w:t xml:space="preserve">ちばケアタクシー 事前確定運賃システム</w:t>
       </w:r>
     </w:p>
     <w:p>
@@ -9571,7 +9747,7 @@
           <w:sz w:val="21"/>
           <w:szCs w:val="21"/>
         </w:rPr>
-        <w:t xml:space="preserve">対象：介護タクシーLP / 見積シミュレーター / 予約システム / メーターアプリ</w:t>
+        <w:t xml:space="preserve">（LP見積シミュレーター、予約システム、乗務員端末メーターアプリの総称）</w:t>
       </w:r>
     </w:p>
     <w:p>
@@ -9607,7 +9783,41 @@
           <w:sz w:val="21"/>
           <w:szCs w:val="21"/>
         </w:rPr>
-        <w:t xml:space="preserve">千葉交通圏（申請書・別紙1参照）</w:t>
+        <w:t xml:space="preserve">営業区域：千葉県（申請書・別紙1参照）</w:t>
+      </w:r>
+    </w:p>
+    <w:p>
+      <w:pPr>
+        <w:spacing w:after="120" w:before="0"/>
+      </w:pPr>
+      <w:r>
+        <w:rPr>
+          <w:rFonts w:ascii="Yu Gothic" w:cs="Yu Gothic" w:eastAsia="Yu Gothic" w:hAnsi="Yu Gothic"/>
+          <w:b w:val="false"/>
+          <w:bCs w:val="false"/>
+          <w:i w:val="false"/>
+          <w:iCs w:val="false"/>
+          <w:sz w:val="21"/>
+          <w:szCs w:val="21"/>
+        </w:rPr>
+        <w:t xml:space="preserve">適用交通圏：千葉交通圏</w:t>
+      </w:r>
+    </w:p>
+    <w:p>
+      <w:pPr>
+        <w:spacing w:after="120" w:before="0"/>
+      </w:pPr>
+      <w:r>
+        <w:rPr>
+          <w:rFonts w:ascii="Yu Gothic" w:cs="Yu Gothic" w:eastAsia="Yu Gothic" w:hAnsi="Yu Gothic"/>
+          <w:b w:val="false"/>
+          <w:bCs w:val="false"/>
+          <w:i w:val="false"/>
+          <w:iCs w:val="false"/>
+          <w:sz w:val="21"/>
+          <w:szCs w:val="21"/>
+        </w:rPr>
+        <w:t xml:space="preserve">平準化係数：千葉交通圏 1.18</w:t>
       </w:r>
     </w:p>
     <w:p>
@@ -9991,7 +10201,7 @@
           <w:sz w:val="21"/>
           <w:szCs w:val="21"/>
         </w:rPr>
-        <w:t xml:space="preserve">距離制運賃を基準にする（申請予定または認可後の距離制運賃表に基づく）</w:t>
+        <w:t xml:space="preserve">距離制運賃表（別紙1）に基づく</w:t>
       </w:r>
     </w:p>
     <w:p>
@@ -14329,7 +14539,7 @@
           <w:sz w:val="21"/>
           <w:szCs w:val="21"/>
         </w:rPr>
-        <w:t xml:space="preserve">実際の申請時には、申請予定または認可後の距離制運賃表を別紙として添付し、本システムの距離制運賃マスターが当該運賃表に基づくことを示す。</w:t>
+        <w:t xml:space="preserve">本システムの距離制運賃マスターは、別紙1の距離制運賃表（初乗運賃、加算運賃、時間距離併用運賃及び時間制運賃）を基準として設定する。</w:t>
       </w:r>
     </w:p>
     <w:p>
@@ -14438,7 +14648,7 @@
                 <w:sz w:val="19"/>
                 <w:szCs w:val="19"/>
               </w:rPr>
-              <w:t xml:space="preserve">営業区域</w:t>
+              <w:t xml:space="preserve">交通圏</w:t>
             </w:r>
           </w:p>
         </w:tc>
@@ -14994,7 +15204,7 @@
           <w:sz w:val="21"/>
           <w:szCs w:val="21"/>
         </w:rPr>
-        <w:t xml:space="preserve">距離制運賃を基準にする（申請予定または認可後の距離制運賃表に基づく）</w:t>
+        <w:t xml:space="preserve">距離制運賃表（別紙1）に基づく</w:t>
       </w:r>
     </w:p>
     <w:p>
@@ -29730,7 +29940,26 @@
           <w:sz w:val="21"/>
           <w:szCs w:val="21"/>
         </w:rPr>
-        <w:t xml:space="preserve">以下は、コード・API・DB上の動作確認後、提出前または運用開始前に運用者が画面上で最終目視確認を行う項目である。</w:t>
+        <w:t xml:space="preserve">以下は、コード・API・DB上で動作確認済みの項目と、運用開始前に実機目視確認を行う項目を区分して記載する。</w:t>
+      </w:r>
+    </w:p>
+    <w:p>
+      <w:pPr>
+        <w:pStyle w:val="Heading3"/>
+        <w:spacing w:after="160" w:before="200"/>
+        <w:jc w:val="left"/>
+      </w:pPr>
+      <w:r>
+        <w:rPr>
+          <w:rFonts w:ascii="Yu Gothic" w:cs="Yu Gothic" w:eastAsia="Yu Gothic" w:hAnsi="Yu Gothic"/>
+          <w:b/>
+          <w:bCs/>
+          <w:i w:val="false"/>
+          <w:iCs w:val="false"/>
+          <w:sz w:val="25"/>
+          <w:szCs w:val="25"/>
+        </w:rPr>
+        <w:t xml:space="preserve">コード・API・DB上で動作確認済み</w:t>
       </w:r>
     </w:p>
     <w:p>
@@ -29752,7 +29981,7 @@
           <w:sz w:val="21"/>
           <w:szCs w:val="21"/>
         </w:rPr>
-        <w:t xml:space="preserve">管理画面予約詳細の目視確認</w:t>
+        <w:t xml:space="preserve">本番相当環境E2E確認（見積登録・予約作成・メーター読取・運行開始・精算完了）— 確認済み</w:t>
       </w:r>
     </w:p>
     <w:p>
@@ -29774,7 +30003,7 @@
           <w:sz w:val="21"/>
           <w:szCs w:val="21"/>
         </w:rPr>
-        <w:t xml:space="preserve">メーターアプリ案件詳細の目視確認</w:t>
+        <w:t xml:space="preserve">snapshotHash照合（見積登録時とメーター読取時の整合性）— 確認済み</w:t>
       </w:r>
     </w:p>
     <w:p>
@@ -29796,7 +30025,26 @@
           <w:sz w:val="21"/>
           <w:szCs w:val="21"/>
         </w:rPr>
-        <w:t xml:space="preserve">運転者画面における同一ルートまたは主要経由地点の目視確認</w:t>
+        <w:t xml:space="preserve">confirmedFareMatchesSnapshot（当初同意済み運賃額と読取運賃の一致）— 確認済み</w:t>
+      </w:r>
+    </w:p>
+    <w:p>
+      <w:pPr>
+        <w:pStyle w:val="Heading3"/>
+        <w:spacing w:after="160" w:before="200"/>
+        <w:jc w:val="left"/>
+      </w:pPr>
+      <w:r>
+        <w:rPr>
+          <w:rFonts w:ascii="Yu Gothic" w:cs="Yu Gothic" w:eastAsia="Yu Gothic" w:hAnsi="Yu Gothic"/>
+          <w:b/>
+          <w:bCs/>
+          <w:i w:val="false"/>
+          <w:iCs w:val="false"/>
+          <w:sz w:val="25"/>
+          <w:szCs w:val="25"/>
+        </w:rPr>
+        <w:t xml:space="preserve">運用開始前に実機目視確認を行う項目</w:t>
       </w:r>
     </w:p>
     <w:p>
@@ -29818,7 +30066,7 @@
           <w:sz w:val="21"/>
           <w:szCs w:val="21"/>
         </w:rPr>
-        <w:t xml:space="preserve">通常メーター新規運行導線の目視確認</w:t>
+        <w:t xml:space="preserve">管理画面予約詳細の実機目視確認</w:t>
       </w:r>
     </w:p>
     <w:p>
@@ -29840,7 +30088,7 @@
           <w:sz w:val="21"/>
           <w:szCs w:val="21"/>
         </w:rPr>
-        <w:t xml:space="preserve">事前確定運賃M以外の通常メーターモード基本動作確認</w:t>
+        <w:t xml:space="preserve">メーターアプリ案件詳細の実機目視確認</w:t>
       </w:r>
     </w:p>
     <w:p>
@@ -29862,79 +30110,7 @@
           <w:sz w:val="21"/>
           <w:szCs w:val="21"/>
         </w:rPr>
-        <w:t xml:space="preserve">精算時の障害者割引・福祉タクシー券処理の目視確認（割引対象運賃・割引額・充当額の記録）</w:t>
-      </w:r>
-    </w:p>
-    <w:p>
-      <w:pPr>
-        <w:spacing w:after="120" w:before="0"/>
-      </w:pPr>
-      <w:r>
-        <w:rPr>
-          <w:rFonts w:ascii="Yu Gothic" w:cs="Yu Gothic" w:eastAsia="Yu Gothic" w:hAnsi="Yu Gothic"/>
-          <w:b w:val="false"/>
-          <w:bCs w:val="false"/>
-          <w:i w:val="false"/>
-          <w:iCs w:val="false"/>
-          <w:sz w:val="21"/>
-          <w:szCs w:val="21"/>
-        </w:rPr>
-        <w:t xml:space="preserve">提出直前に確認完了した場合は、見出しを「運用開始前確認結果」に変更し、各項目末尾を「確認済み」に差し替え可能です。</w:t>
-      </w:r>
-    </w:p>
-    <w:p>
-      <w:pPr>
-        <w:pStyle w:val="Heading3"/>
-        <w:spacing w:after="160" w:before="200"/>
-        <w:jc w:val="left"/>
-      </w:pPr>
-      <w:r>
-        <w:rPr>
-          <w:rFonts w:ascii="Yu Gothic" w:cs="Yu Gothic" w:eastAsia="Yu Gothic" w:hAnsi="Yu Gothic"/>
-          <w:b/>
-          <w:bCs/>
-          <w:i w:val="false"/>
-          <w:iCs w:val="false"/>
-          <w:sz w:val="25"/>
-          <w:szCs w:val="25"/>
-        </w:rPr>
-        <w:t xml:space="preserve">運転者向けルート表示の最終確認</w:t>
-      </w:r>
-    </w:p>
-    <w:p>
-      <w:pPr>
-        <w:spacing w:after="120" w:before="0"/>
-      </w:pPr>
-      <w:r>
-        <w:rPr>
-          <w:rFonts w:ascii="Yu Gothic" w:cs="Yu Gothic" w:eastAsia="Yu Gothic" w:hAnsi="Yu Gothic"/>
-          <w:b w:val="false"/>
-          <w:bCs w:val="false"/>
-          <w:i w:val="false"/>
-          <w:iCs w:val="false"/>
-          <w:sz w:val="21"/>
-          <w:szCs w:val="21"/>
-        </w:rPr>
-        <w:t xml:space="preserve">運転者向けルート地図描画（polyline表示）は未実装のため、同一ルートまたは主要経由地点の最終目視確認は第10章の運用開始前確認項目とする。</w:t>
-      </w:r>
-    </w:p>
-    <w:p>
-      <w:pPr>
-        <w:pStyle w:val="Heading3"/>
-        <w:spacing w:after="160" w:before="200"/>
-        <w:jc w:val="left"/>
-      </w:pPr>
-      <w:r>
-        <w:rPr>
-          <w:rFonts w:ascii="Yu Gothic" w:cs="Yu Gothic" w:eastAsia="Yu Gothic" w:hAnsi="Yu Gothic"/>
-          <w:b/>
-          <w:bCs/>
-          <w:i w:val="false"/>
-          <w:iCs w:val="false"/>
-          <w:sz w:val="25"/>
-          <w:szCs w:val="25"/>
-        </w:rPr>
-        <w:t xml:space="preserve">将来強化候補</w:t>
+        <w:t xml:space="preserve">運転者画面における同一ルートまたは主要経由地点の実機目視確認</w:t>
       </w:r>
     </w:p>
     <w:p>
@@ -29956,7 +30132,7 @@
           <w:sz w:val="21"/>
           <w:szCs w:val="21"/>
         </w:rPr>
-        <w:t xml:space="preserve">サーバー署名（HMAC等）— 将来的な外部API連携・複数事業者連携時の追加対策として検討</w:t>
+        <w:t xml:space="preserve">通常メーター新規運行導線の実機目視確認</w:t>
       </w:r>
     </w:p>
     <w:p>
@@ -29978,7 +30154,7 @@
           <w:sz w:val="21"/>
           <w:szCs w:val="21"/>
         </w:rPr>
-        <w:t xml:space="preserve">運転者向けルート地図描画（polyline表示）の最終目視確認</w:t>
+        <w:t xml:space="preserve">事前確定運賃M以外の通常メーターモード基本動作の実機目視確認</w:t>
       </w:r>
     </w:p>
     <w:p>
@@ -30000,7 +30176,62 @@
           <w:sz w:val="21"/>
           <w:szCs w:val="21"/>
         </w:rPr>
-        <w:t xml:space="preserve">Firebase ID Token検証の今後対応</w:t>
+        <w:t xml:space="preserve">精算時の障害者割引・福祉タクシー券処理の実機目視確認</w:t>
+      </w:r>
+    </w:p>
+    <w:p>
+      <w:pPr>
+        <w:pStyle w:val="Heading3"/>
+        <w:spacing w:after="160" w:before="200"/>
+        <w:jc w:val="left"/>
+      </w:pPr>
+      <w:r>
+        <w:rPr>
+          <w:rFonts w:ascii="Yu Gothic" w:cs="Yu Gothic" w:eastAsia="Yu Gothic" w:hAnsi="Yu Gothic"/>
+          <w:b/>
+          <w:bCs/>
+          <w:i w:val="false"/>
+          <w:iCs w:val="false"/>
+          <w:sz w:val="25"/>
+          <w:szCs w:val="25"/>
+        </w:rPr>
+        <w:t xml:space="preserve">運転者向けルート表示の最終確認</w:t>
+      </w:r>
+    </w:p>
+    <w:p>
+      <w:pPr>
+        <w:spacing w:after="120" w:before="0"/>
+      </w:pPr>
+      <w:r>
+        <w:rPr>
+          <w:rFonts w:ascii="Yu Gothic" w:cs="Yu Gothic" w:eastAsia="Yu Gothic" w:hAnsi="Yu Gothic"/>
+          <w:b w:val="false"/>
+          <w:bCs w:val="false"/>
+          <w:i w:val="false"/>
+          <w:iCs w:val="false"/>
+          <w:sz w:val="21"/>
+          <w:szCs w:val="21"/>
+        </w:rPr>
+        <w:t xml:space="preserve">運転者向けルート地図描画（polyline表示）は未実装のため、同一ルートまたは主要経由地点の最終目視確認は第10章の運用開始前確認項目とする。</w:t>
+      </w:r>
+    </w:p>
+    <w:p>
+      <w:pPr>
+        <w:pStyle w:val="Heading3"/>
+        <w:spacing w:after="160" w:before="200"/>
+        <w:jc w:val="left"/>
+      </w:pPr>
+      <w:r>
+        <w:rPr>
+          <w:rFonts w:ascii="Yu Gothic" w:cs="Yu Gothic" w:eastAsia="Yu Gothic" w:hAnsi="Yu Gothic"/>
+          <w:b/>
+          <w:bCs/>
+          <w:i w:val="false"/>
+          <w:iCs w:val="false"/>
+          <w:sz w:val="25"/>
+          <w:szCs w:val="25"/>
+        </w:rPr>
+        <w:t xml:space="preserve">将来強化候補</w:t>
       </w:r>
     </w:p>
     <w:p>
@@ -30022,7 +30253,7 @@
           <w:sz w:val="21"/>
           <w:szCs w:val="21"/>
         </w:rPr>
-        <w:t xml:space="preserve">利用明細書PDF fixed専用表示対応</w:t>
+        <w:t xml:space="preserve">サーバー署名（HMAC等）— 将来的な外部API連携・複数事業者連携時の追加対策として検討</w:t>
       </w:r>
     </w:p>
     <w:p>
@@ -30044,26 +30275,7 @@
           <w:sz w:val="21"/>
           <w:szCs w:val="21"/>
         </w:rPr>
-        <w:t xml:space="preserve">本番相当E2E証跡の定期更新</w:t>
-      </w:r>
-    </w:p>
-    <w:p>
-      <w:pPr>
-        <w:pStyle w:val="Heading3"/>
-        <w:spacing w:after="160" w:before="200"/>
-        <w:jc w:val="left"/>
-      </w:pPr>
-      <w:r>
-        <w:rPr>
-          <w:rFonts w:ascii="Yu Gothic" w:cs="Yu Gothic" w:eastAsia="Yu Gothic" w:hAnsi="Yu Gothic"/>
-          <w:b/>
-          <w:bCs/>
-          <w:i w:val="false"/>
-          <w:iCs w:val="false"/>
-          <w:sz w:val="25"/>
-          <w:szCs w:val="25"/>
-        </w:rPr>
-        <w:t xml:space="preserve">認証・セキュリティの今後対応</w:t>
+        <w:t xml:space="preserve">運転者向けルート地図描画（polyline表示）の最終目視確認</w:t>
       </w:r>
     </w:p>
     <w:p>
@@ -30085,7 +30297,7 @@
           <w:sz w:val="21"/>
           <w:szCs w:val="21"/>
         </w:rPr>
-        <w:t xml:space="preserve">driver-proxyは現時点では「トークン非露出プロキシ」です。ブラウザからの正当なアクセスを中継します。</w:t>
+        <w:t xml:space="preserve">Firebase ID Token検証の今後対応</w:t>
       </w:r>
     </w:p>
     <w:p>
@@ -30107,7 +30319,7 @@
           <w:sz w:val="21"/>
           <w:szCs w:val="21"/>
         </w:rPr>
-        <w:t xml:space="preserve">CORS設定だけでは、curl等による直接アクセスを完全には防げません。</w:t>
+        <w:t xml:space="preserve">利用明細書PDF fixed専用表示対応</w:t>
       </w:r>
     </w:p>
     <w:p>
@@ -30129,7 +30341,7 @@
           <w:sz w:val="21"/>
           <w:szCs w:val="21"/>
         </w:rPr>
-        <w:t xml:space="preserve">次フェーズで Firebase ID Token 検証を driver-proxy に追加予定です。</w:t>
+        <w:t xml:space="preserve">本番相当E2E証跡の定期更新</w:t>
       </w:r>
     </w:p>
     <w:p>
@@ -30148,7 +30360,7 @@
           <w:sz w:val="25"/>
           <w:szCs w:val="25"/>
         </w:rPr>
-        <w:t xml:space="preserve">根拠資料・確認資料一覧</w:t>
+        <w:t xml:space="preserve">認証・セキュリティの今後対応</w:t>
       </w:r>
     </w:p>
     <w:p>
@@ -30170,7 +30382,7 @@
           <w:sz w:val="21"/>
           <w:szCs w:val="21"/>
         </w:rPr>
-        <w:t xml:space="preserve">事前確定運賃システム概要書 兼 関東運輸局公示要件対応表</w:t>
+        <w:t xml:space="preserve">driver-proxyは現時点では「トークン非露出プロキシ」です。ブラウザからの正当なアクセスを中継します。</w:t>
       </w:r>
     </w:p>
     <w:p>
@@ -30192,7 +30404,7 @@
           <w:sz w:val="21"/>
           <w:szCs w:val="21"/>
         </w:rPr>
-        <w:t xml:space="preserve">事前確定運賃システム説明資料</w:t>
+        <w:t xml:space="preserve">CORS設定だけでは、curl等による直接アクセスを完全には防げません。</w:t>
       </w:r>
     </w:p>
     <w:p>
@@ -30214,7 +30426,26 @@
           <w:sz w:val="21"/>
           <w:szCs w:val="21"/>
         </w:rPr>
-        <w:t xml:space="preserve">事前確定運賃M 運用・監査説明資料</w:t>
+        <w:t xml:space="preserve">次フェーズで Firebase ID Token 検証を driver-proxy に追加予定です。</w:t>
+      </w:r>
+    </w:p>
+    <w:p>
+      <w:pPr>
+        <w:pStyle w:val="Heading3"/>
+        <w:spacing w:after="160" w:before="200"/>
+        <w:jc w:val="left"/>
+      </w:pPr>
+      <w:r>
+        <w:rPr>
+          <w:rFonts w:ascii="Yu Gothic" w:cs="Yu Gothic" w:eastAsia="Yu Gothic" w:hAnsi="Yu Gothic"/>
+          <w:b/>
+          <w:bCs/>
+          <w:i w:val="false"/>
+          <w:iCs w:val="false"/>
+          <w:sz w:val="25"/>
+          <w:szCs w:val="25"/>
+        </w:rPr>
+        <w:t xml:space="preserve">根拠資料・確認資料一覧</w:t>
       </w:r>
     </w:p>
     <w:p>
@@ -30236,7 +30467,7 @@
           <w:sz w:val="21"/>
           <w:szCs w:val="21"/>
         </w:rPr>
-        <w:t xml:space="preserve">reservation-v4 test:phase5 実行結果</w:t>
+        <w:t xml:space="preserve">事前確定運賃システム概要書 兼 関東運輸局公示要件対応表</w:t>
       </w:r>
     </w:p>
     <w:p>
@@ -30258,7 +30489,7 @@
           <w:sz w:val="21"/>
           <w:szCs w:val="21"/>
         </w:rPr>
-        <w:t xml:space="preserve">care-taxi-meter 本番GitHub Pages反映確認</w:t>
+        <w:t xml:space="preserve">事前確定運賃システム説明資料</w:t>
       </w:r>
     </w:p>
     <w:p>
@@ -30280,7 +30511,7 @@
           <w:sz w:val="21"/>
           <w:szCs w:val="21"/>
         </w:rPr>
-        <w:t xml:space="preserve">complete-fixed-fare 本番相当環境E2E確認結果</w:t>
+        <w:t xml:space="preserve">事前確定運賃M 運用・監査説明資料</w:t>
       </w:r>
     </w:p>
     <w:p>
@@ -30302,7 +30533,7 @@
           <w:sz w:val="21"/>
           <w:szCs w:val="21"/>
         </w:rPr>
-        <w:t xml:space="preserve">事前確定運賃システム 追加資料（データ保存・画面キャプチャ・E2E・改ざん防止）</w:t>
+        <w:t xml:space="preserve">reservation-v4 test:phase5 実行結果</w:t>
       </w:r>
     </w:p>
     <w:p>
@@ -30324,7 +30555,7 @@
           <w:sz w:val="21"/>
           <w:szCs w:val="21"/>
         </w:rPr>
-        <w:t xml:space="preserve">本番D1 migration 0005 適用確認</w:t>
+        <w:t xml:space="preserve">care-taxi-meter 本番GitHub Pages反映確認</w:t>
       </w:r>
     </w:p>
     <w:p>
@@ -30346,7 +30577,7 @@
           <w:sz w:val="21"/>
           <w:szCs w:val="21"/>
         </w:rPr>
-        <w:t xml:space="preserve">本番D1予約データ整理記録</w:t>
+        <w:t xml:space="preserve">complete-fixed-fare 本番相当環境E2E確認結果</w:t>
       </w:r>
     </w:p>
     <w:p>
@@ -30368,26 +30599,7 @@
           <w:sz w:val="21"/>
           <w:szCs w:val="21"/>
         </w:rPr>
-        <w:t xml:space="preserve">申請予定または認可後の距離制運賃表</w:t>
-      </w:r>
-    </w:p>
-    <w:p>
-      <w:pPr>
-        <w:pStyle w:val="Heading3"/>
-        <w:spacing w:after="160" w:before="200"/>
-        <w:jc w:val="left"/>
-      </w:pPr>
-      <w:r>
-        <w:rPr>
-          <w:rFonts w:ascii="Yu Gothic" w:cs="Yu Gothic" w:eastAsia="Yu Gothic" w:hAnsi="Yu Gothic"/>
-          <w:b/>
-          <w:bCs/>
-          <w:i w:val="false"/>
-          <w:iCs w:val="false"/>
-          <w:sz w:val="25"/>
-          <w:szCs w:val="25"/>
-        </w:rPr>
-        <w:t xml:space="preserve">申請担当者による最終確認項目</w:t>
+        <w:t xml:space="preserve">事前確定運賃システム 追加資料（データ保存・画面キャプチャ・E2E・改ざん防止）</w:t>
       </w:r>
     </w:p>
     <w:p>
@@ -30409,7 +30621,7 @@
           <w:sz w:val="21"/>
           <w:szCs w:val="21"/>
         </w:rPr>
-        <w:t xml:space="preserve">申請書代表者印の押印</w:t>
+        <w:t xml:space="preserve">本番D1 migration 0005 適用確認</w:t>
       </w:r>
     </w:p>
     <w:p>
@@ -30431,7 +30643,7 @@
           <w:sz w:val="21"/>
           <w:szCs w:val="21"/>
         </w:rPr>
-        <w:t xml:space="preserve">別紙1・別紙2の最終数値確認</w:t>
+        <w:t xml:space="preserve">本番D1予約データ整理記録</w:t>
       </w:r>
     </w:p>
     <w:p>
@@ -30453,7 +30665,26 @@
           <w:sz w:val="21"/>
           <w:szCs w:val="21"/>
         </w:rPr>
-        <w:t xml:space="preserve">画面証跡の実画面一致確認</w:t>
+        <w:t xml:space="preserve">別紙1 距離制運賃表</w:t>
+      </w:r>
+    </w:p>
+    <w:p>
+      <w:pPr>
+        <w:pStyle w:val="Heading3"/>
+        <w:spacing w:after="160" w:before="200"/>
+        <w:jc w:val="left"/>
+      </w:pPr>
+      <w:r>
+        <w:rPr>
+          <w:rFonts w:ascii="Yu Gothic" w:cs="Yu Gothic" w:eastAsia="Yu Gothic" w:hAnsi="Yu Gothic"/>
+          <w:b/>
+          <w:bCs/>
+          <w:i w:val="false"/>
+          <w:iCs w:val="false"/>
+          <w:sz w:val="25"/>
+          <w:szCs w:val="25"/>
+        </w:rPr>
+        <w:t xml:space="preserve">申請担当者による最終確認項目</w:t>
       </w:r>
     </w:p>
     <w:p>
@@ -30475,7 +30706,7 @@
           <w:sz w:val="21"/>
           <w:szCs w:val="21"/>
         </w:rPr>
-        <w:t xml:space="preserve">一式PDFのページ対応表と実ページの照合</w:t>
+        <w:t xml:space="preserve">申請書代表者印の押印</w:t>
       </w:r>
     </w:p>
     <w:p>
@@ -30497,12 +30728,17 @@
           <w:sz w:val="21"/>
           <w:szCs w:val="21"/>
         </w:rPr>
-        <w:t xml:space="preserve">運用開始前目視確認項目の実施記録</w:t>
-      </w:r>
-    </w:p>
-    <w:p>
-      <w:pPr>
-        <w:spacing w:after="120" w:before="0"/>
+        <w:t xml:space="preserve">別紙1・別紙2の最終数値確認</w:t>
+      </w:r>
+    </w:p>
+    <w:p>
+      <w:pPr>
+        <w:pStyle w:val="ListParagraph"/>
+        <w:numPr>
+          <w:ilvl w:val="0"/>
+          <w:numId w:val="1"/>
+        </w:numPr>
+        <w:spacing w:after="60"/>
       </w:pPr>
       <w:r>
         <w:rPr>
@@ -30514,7 +30750,68 @@
           <w:sz w:val="21"/>
           <w:szCs w:val="21"/>
         </w:rPr>
-        <w:t xml:space="preserve">本資料は運輸局への提出用説明資料案です。公示要件に沿った運用が説明可能な状態を示すものであり、最終的な申請書類への転記・体裁調整は申請担当者が行ってください。</w:t>
+        <w:t xml:space="preserve">画面証跡の実画面一致確認</w:t>
+      </w:r>
+    </w:p>
+    <w:p>
+      <w:pPr>
+        <w:pStyle w:val="ListParagraph"/>
+        <w:numPr>
+          <w:ilvl w:val="0"/>
+          <w:numId w:val="1"/>
+        </w:numPr>
+        <w:spacing w:after="60"/>
+      </w:pPr>
+      <w:r>
+        <w:rPr>
+          <w:rFonts w:ascii="Yu Gothic" w:cs="Yu Gothic" w:eastAsia="Yu Gothic" w:hAnsi="Yu Gothic"/>
+          <w:b w:val="false"/>
+          <w:bCs w:val="false"/>
+          <w:i w:val="false"/>
+          <w:iCs w:val="false"/>
+          <w:sz w:val="21"/>
+          <w:szCs w:val="21"/>
+        </w:rPr>
+        <w:t xml:space="preserve">一式PDFのページ対応表と実ページの照合</w:t>
+      </w:r>
+    </w:p>
+    <w:p>
+      <w:pPr>
+        <w:pStyle w:val="ListParagraph"/>
+        <w:numPr>
+          <w:ilvl w:val="0"/>
+          <w:numId w:val="1"/>
+        </w:numPr>
+        <w:spacing w:after="60"/>
+      </w:pPr>
+      <w:r>
+        <w:rPr>
+          <w:rFonts w:ascii="Yu Gothic" w:cs="Yu Gothic" w:eastAsia="Yu Gothic" w:hAnsi="Yu Gothic"/>
+          <w:b w:val="false"/>
+          <w:bCs w:val="false"/>
+          <w:i w:val="false"/>
+          <w:iCs w:val="false"/>
+          <w:sz w:val="21"/>
+          <w:szCs w:val="21"/>
+        </w:rPr>
+        <w:t xml:space="preserve">運用開始前目視確認項目の実施記録</w:t>
+      </w:r>
+    </w:p>
+    <w:p>
+      <w:pPr>
+        <w:spacing w:after="120" w:before="0"/>
+      </w:pPr>
+      <w:r>
+        <w:rPr>
+          <w:rFonts w:ascii="Yu Gothic" w:cs="Yu Gothic" w:eastAsia="Yu Gothic" w:hAnsi="Yu Gothic"/>
+          <w:b w:val="false"/>
+          <w:bCs w:val="false"/>
+          <w:i w:val="false"/>
+          <w:iCs w:val="false"/>
+          <w:sz w:val="21"/>
+          <w:szCs w:val="21"/>
+        </w:rPr>
+        <w:t xml:space="preserve">本資料は運輸局への提出用説明資料です。公示要件に沿った運用が説明可能な状態を示すものです。</w:t>
       </w:r>
     </w:p>
     <w:p>
@@ -41412,7 +41709,7 @@
           <w:sz w:val="21"/>
           <w:szCs w:val="21"/>
         </w:rPr>
-        <w:t xml:space="preserve">本資料は運輸局提出用の運用・監査説明資料です。最終的な申請書類への転記・体裁調整は、申請担当者が行ってください。</w:t>
+        <w:t xml:space="preserve">本資料は運輸局提出用の運用・監査説明資料です。</w:t>
       </w:r>
     </w:p>
     <w:p>
@@ -42252,7 +42549,43 @@
           <w:sz w:val="21"/>
           <w:szCs w:val="21"/>
         </w:rPr>
-        <w:t xml:space="preserve">事前確定運賃認可の事前相談・提出時に、統合説明資料へ添付しやすい別紙・確認資料の一式である。</w:t>
+        <w:t xml:space="preserve">本別紙セットは、事前確定運賃の算定根拠、係数、距離制運賃表及び各種料金表を整理した添付資料である。</w:t>
+      </w:r>
+    </w:p>
+    <w:p>
+      <w:pPr>
+        <w:pStyle w:val="Heading2"/>
+        <w:spacing w:after="160" w:before="200"/>
+        <w:jc w:val="left"/>
+      </w:pPr>
+      <w:r>
+        <w:rPr>
+          <w:rFonts w:ascii="Yu Gothic" w:cs="Yu Gothic" w:eastAsia="Yu Gothic" w:hAnsi="Yu Gothic"/>
+          <w:b/>
+          <w:bCs/>
+          <w:i w:val="false"/>
+          <w:iCs w:val="false"/>
+          <w:sz w:val="30"/>
+          <w:szCs w:val="30"/>
+        </w:rPr>
+        <w:t xml:space="preserve">事前確定運賃 認可申請様式リンク・記入補助シート</w:t>
+      </w:r>
+    </w:p>
+    <w:p>
+      <w:pPr>
+        <w:spacing w:after="120" w:before="0"/>
+      </w:pPr>
+      <w:r>
+        <w:rPr>
+          <w:rFonts w:ascii="Yu Gothic" w:cs="Yu Gothic" w:eastAsia="Yu Gothic" w:hAnsi="Yu Gothic"/>
+          <w:b w:val="false"/>
+          <w:bCs w:val="false"/>
+          <w:i w:val="false"/>
+          <w:iCs w:val="false"/>
+          <w:sz w:val="21"/>
+          <w:szCs w:val="21"/>
+        </w:rPr>
+        <w:t xml:space="preserve">作成日：2026/07/05　事業者名：株式会社 千葉福祉サポート　屋号：ちばケアタクシー</w:t>
       </w:r>
     </w:p>
     <w:p>
@@ -42274,43 +42607,7 @@
           <w:sz w:val="21"/>
           <w:szCs w:val="21"/>
         </w:rPr>
-        <w:t xml:space="preserve">各別紙はWord上で改ページ・余白・表を手動調整して使用する。</w:t>
-      </w:r>
-    </w:p>
-    <w:p>
-      <w:pPr>
-        <w:pStyle w:val="Heading2"/>
-        <w:spacing w:after="160" w:before="200"/>
-        <w:jc w:val="left"/>
-      </w:pPr>
-      <w:r>
-        <w:rPr>
-          <w:rFonts w:ascii="Yu Gothic" w:cs="Yu Gothic" w:eastAsia="Yu Gothic" w:hAnsi="Yu Gothic"/>
-          <w:b/>
-          <w:bCs/>
-          <w:i w:val="false"/>
-          <w:iCs w:val="false"/>
-          <w:sz w:val="30"/>
-          <w:szCs w:val="30"/>
-        </w:rPr>
-        <w:t xml:space="preserve">事前確定運賃 認可申請様式リンク・記入補助シート</w:t>
-      </w:r>
-    </w:p>
-    <w:p>
-      <w:pPr>
-        <w:spacing w:after="120" w:before="0"/>
-      </w:pPr>
-      <w:r>
-        <w:rPr>
-          <w:rFonts w:ascii="Yu Gothic" w:cs="Yu Gothic" w:eastAsia="Yu Gothic" w:hAnsi="Yu Gothic"/>
-          <w:b w:val="false"/>
-          <w:bCs w:val="false"/>
-          <w:i w:val="false"/>
-          <w:iCs w:val="false"/>
-          <w:sz w:val="21"/>
-          <w:szCs w:val="21"/>
-        </w:rPr>
-        <w:t xml:space="preserve">作成日：2026/07/05　事業者名：株式会社 千葉福祉サポート　屋号：ちばケアタクシー</w:t>
+        <w:t xml:space="preserve">正式な申請様式は、関東運輸局の「事前確定運賃認可申請様式（Word）」を使用する。</w:t>
       </w:r>
     </w:p>
     <w:p>
@@ -42332,51 +42629,7 @@
           <w:sz w:val="21"/>
           <w:szCs w:val="21"/>
         </w:rPr>
-        <w:t xml:space="preserve">正式な申請様式は、関東運輸局の「事前確定運賃認可申請様式（Word）」を使用する。</w:t>
-      </w:r>
-    </w:p>
-    <w:p>
-      <w:pPr>
-        <w:pStyle w:val="ListParagraph"/>
-        <w:numPr>
-          <w:ilvl w:val="0"/>
-          <w:numId w:val="1"/>
-        </w:numPr>
-        <w:spacing w:after="60"/>
-      </w:pPr>
-      <w:r>
-        <w:rPr>
-          <w:rFonts w:ascii="Yu Gothic" w:cs="Yu Gothic" w:eastAsia="Yu Gothic" w:hAnsi="Yu Gothic"/>
-          <w:b w:val="false"/>
-          <w:bCs w:val="false"/>
-          <w:i w:val="false"/>
-          <w:iCs w:val="false"/>
-          <w:sz w:val="21"/>
-          <w:szCs w:val="21"/>
-        </w:rPr>
         <w:t xml:space="preserve">本シートは、公式様式へ転記するための記入補助資料である。</w:t>
-      </w:r>
-    </w:p>
-    <w:p>
-      <w:pPr>
-        <w:pStyle w:val="ListParagraph"/>
-        <w:numPr>
-          <w:ilvl w:val="0"/>
-          <w:numId w:val="1"/>
-        </w:numPr>
-        <w:spacing w:after="60"/>
-      </w:pPr>
-      <w:r>
-        <w:rPr>
-          <w:rFonts w:ascii="Yu Gothic" w:cs="Yu Gothic" w:eastAsia="Yu Gothic" w:hAnsi="Yu Gothic"/>
-          <w:b w:val="false"/>
-          <w:bCs w:val="false"/>
-          <w:i w:val="false"/>
-          <w:iCs w:val="false"/>
-          <w:sz w:val="21"/>
-          <w:szCs w:val="21"/>
-        </w:rPr>
-        <w:t xml:space="preserve">最終的な様式の記入・押印・添付書類確認は申請担当者が行う。</w:t>
       </w:r>
     </w:p>
     <w:p>
@@ -42815,7 +43068,7 @@
                 <w:sz w:val="19"/>
                 <w:szCs w:val="19"/>
               </w:rPr>
-              <w:t xml:space="preserve">申請書本体に記載の営業区域に合わせて記入</w:t>
+              <w:t xml:space="preserve">千葉県</w:t>
             </w:r>
           </w:p>
         </w:tc>
@@ -43125,7 +43378,7 @@
                 <w:sz w:val="19"/>
                 <w:szCs w:val="19"/>
               </w:rPr>
-              <w:t xml:space="preserve">申請対象交通圏について、関東運輸局公示の係数を転記</w:t>
+              <w:t xml:space="preserve">千葉交通圏 1.18</w:t>
             </w:r>
           </w:p>
         </w:tc>
@@ -43621,7 +43874,7 @@
                 <w:sz w:val="19"/>
                 <w:szCs w:val="19"/>
               </w:rPr>
-              <w:t xml:space="preserve">統合説明資料、本別紙セット、E2E確認記録、申請予定または認可後の距離制運賃表</w:t>
+              <w:t xml:space="preserve">統合説明資料、本別紙セット、E2E確認記録、別紙1距離制運賃表</w:t>
             </w:r>
           </w:p>
         </w:tc>
@@ -44412,7 +44665,7 @@
           <w:sz w:val="21"/>
           <w:szCs w:val="21"/>
         </w:rPr>
-        <w:t xml:space="preserve">実際の申請時には、申請予定または認可後の距離制運賃表に基づき、初乗運賃・加算運賃・時間距離併用運賃等を記入する。</w:t>
+        <w:t xml:space="preserve">本システムの距離制運賃マスターは、本表の初乗運賃、加算運賃、時間距離併用運賃及び時間制運賃を基準として設定する。</w:t>
       </w:r>
     </w:p>
     <w:tbl>
@@ -44677,7 +44930,7 @@
                 <w:sz w:val="19"/>
                 <w:szCs w:val="19"/>
               </w:rPr>
-              <w:t xml:space="preserve">申請書本体に記載の営業区域に合わせて記入</w:t>
+              <w:t xml:space="preserve">千葉県</w:t>
             </w:r>
           </w:p>
         </w:tc>
@@ -44739,7 +44992,7 @@
                 <w:sz w:val="19"/>
                 <w:szCs w:val="19"/>
               </w:rPr>
-              <w:t xml:space="preserve">申請書本体に記載の営業区域に対応する交通圏を記入</w:t>
+              <w:t xml:space="preserve">千葉交通圏</w:t>
             </w:r>
           </w:p>
         </w:tc>

</xml_diff>